<commit_message>
feat(facturacion): consistencia integral en facturacion POS, encargos, cotizaciones, contabilidad NIIF y modulo DGI
</commit_message>
<xml_diff>
--- a/Documentacion/Corte4/Proyecto Corte 4 UNIDAD IV corregido - Brajhers Cake.docx
+++ b/Documentacion/Corte4/Proyecto Corte 4 UNIDAD IV corregido - Brajhers Cake.docx
@@ -959,7 +959,7 @@
             </w:pPr>
             <w:fldSimple w:instr="PAGEREF c4_1001 \h">
               <w:r>
-                <w:t>0</w:t>
+                <w:t>3</w:t>
               </w:r>
             </w:fldSimple>
           </w:p>
@@ -997,7 +997,7 @@
             </w:pPr>
             <w:fldSimple w:instr="PAGEREF c4_1002 \h">
               <w:r>
-                <w:t>0</w:t>
+                <w:t>5</w:t>
               </w:r>
             </w:fldSimple>
           </w:p>
@@ -1035,7 +1035,7 @@
             </w:pPr>
             <w:fldSimple w:instr="PAGEREF c4_1003 \h">
               <w:r>
-                <w:t>0</w:t>
+                <w:t>7</w:t>
               </w:r>
             </w:fldSimple>
           </w:p>
@@ -1073,7 +1073,7 @@
             </w:pPr>
             <w:fldSimple w:instr="PAGEREF c4_1004 \h">
               <w:r>
-                <w:t>0</w:t>
+                <w:t>8</w:t>
               </w:r>
             </w:fldSimple>
           </w:p>
@@ -1111,7 +1111,7 @@
             </w:pPr>
             <w:fldSimple w:instr="PAGEREF c4_1005 \h">
               <w:r>
-                <w:t>0</w:t>
+                <w:t>9</w:t>
               </w:r>
             </w:fldSimple>
           </w:p>
@@ -1149,7 +1149,7 @@
             </w:pPr>
             <w:fldSimple w:instr="PAGEREF c4_1006 \h">
               <w:r>
-                <w:t>0</w:t>
+                <w:t>10</w:t>
               </w:r>
             </w:fldSimple>
           </w:p>
@@ -1187,7 +1187,7 @@
             </w:pPr>
             <w:fldSimple w:instr="PAGEREF c4_1007 \h">
               <w:r>
-                <w:t>0</w:t>
+                <w:t>20</w:t>
               </w:r>
             </w:fldSimple>
           </w:p>
@@ -1225,7 +1225,7 @@
             </w:pPr>
             <w:fldSimple w:instr="PAGEREF c4_1008 \h">
               <w:r>
-                <w:t>0</w:t>
+                <w:t>23</w:t>
               </w:r>
             </w:fldSimple>
           </w:p>
@@ -1263,7 +1263,7 @@
             </w:pPr>
             <w:fldSimple w:instr="PAGEREF c4_1009 \h">
               <w:r>
-                <w:t>0</w:t>
+                <w:t>25</w:t>
               </w:r>
             </w:fldSimple>
           </w:p>
@@ -1301,7 +1301,7 @@
             </w:pPr>
             <w:fldSimple w:instr="PAGEREF c4_1010 \h">
               <w:r>
-                <w:t>0</w:t>
+                <w:t>28</w:t>
               </w:r>
             </w:fldSimple>
           </w:p>
@@ -1339,7 +1339,7 @@
             </w:pPr>
             <w:fldSimple w:instr="PAGEREF c4_1011 \h">
               <w:r>
-                <w:t>0</w:t>
+                <w:t>29</w:t>
               </w:r>
             </w:fldSimple>
           </w:p>
@@ -1377,7 +1377,7 @@
             </w:pPr>
             <w:fldSimple w:instr="PAGEREF c4_1012 \h">
               <w:r>
-                <w:t>0</w:t>
+                <w:t>55</w:t>
               </w:r>
             </w:fldSimple>
           </w:p>
@@ -1415,7 +1415,7 @@
             </w:pPr>
             <w:fldSimple w:instr="PAGEREF c4_1013 \h">
               <w:r>
-                <w:t>0</w:t>
+                <w:t>56</w:t>
               </w:r>
             </w:fldSimple>
           </w:p>
@@ -1453,7 +1453,7 @@
             </w:pPr>
             <w:fldSimple w:instr="PAGEREF c4_1014 \h">
               <w:r>
-                <w:t>0</w:t>
+                <w:t>60</w:t>
               </w:r>
             </w:fldSimple>
           </w:p>
@@ -1491,7 +1491,7 @@
             </w:pPr>
             <w:fldSimple w:instr="PAGEREF c4_1015 \h">
               <w:r>
-                <w:t>0</w:t>
+                <w:t>63</w:t>
               </w:r>
             </w:fldSimple>
           </w:p>
@@ -1529,7 +1529,7 @@
             </w:pPr>
             <w:fldSimple w:instr="PAGEREF c4_1016 \h">
               <w:r>
-                <w:t>0</w:t>
+                <w:t>68</w:t>
               </w:r>
             </w:fldSimple>
           </w:p>
@@ -1567,7 +1567,7 @@
             </w:pPr>
             <w:fldSimple w:instr="PAGEREF c4_1017 \h">
               <w:r>
-                <w:t>0</w:t>
+                <w:t>74</w:t>
               </w:r>
             </w:fldSimple>
           </w:p>
@@ -1605,7 +1605,7 @@
             </w:pPr>
             <w:fldSimple w:instr="PAGEREF c4_1018 \h">
               <w:r>
-                <w:t>0</w:t>
+                <w:t>81</w:t>
               </w:r>
             </w:fldSimple>
           </w:p>
@@ -1643,7 +1643,7 @@
             </w:pPr>
             <w:fldSimple w:instr="PAGEREF c4_1019 \h">
               <w:r>
-                <w:t>0</w:t>
+                <w:t>82</w:t>
               </w:r>
             </w:fldSimple>
           </w:p>
@@ -1681,7 +1681,7 @@
             </w:pPr>
             <w:fldSimple w:instr="PAGEREF c4_1020 \h">
               <w:r>
-                <w:t>0</w:t>
+                <w:t>83</w:t>
               </w:r>
             </w:fldSimple>
           </w:p>

</xml_diff>